<commit_message>
Exercice sur les masques réseaux
</commit_message>
<xml_diff>
--- a/RESEAU_LOCAL_ET_SECURITE/Cours10-Masques-réseaux/420-2C5-JR_10_Masques réseaux.docx
+++ b/RESEAU_LOCAL_ET_SECURITE/Cours10-Masques-réseaux/420-2C5-JR_10_Masques réseaux.docx
@@ -8257,6 +8257,9 @@
               <w:pStyle w:val="Code"/>
               <w:cnfStyle w:val="000000000000" w:firstRow="0" w:lastRow="0" w:firstColumn="0" w:lastColumn="0" w:oddVBand="0" w:evenVBand="0" w:oddHBand="0" w:evenHBand="0" w:firstRowFirstColumn="0" w:firstRowLastColumn="0" w:lastRowFirstColumn="0" w:lastRowLastColumn="0"/>
             </w:pPr>
+            <w:r>
+              <w:t>11111111.11111111.11110000.00000000</w:t>
+            </w:r>
           </w:p>
         </w:tc>
       </w:tr>
@@ -8316,6 +8319,9 @@
               <w:pStyle w:val="Code"/>
               <w:cnfStyle w:val="000000100000" w:firstRow="0" w:lastRow="0" w:firstColumn="0" w:lastColumn="0" w:oddVBand="0" w:evenVBand="0" w:oddHBand="1" w:evenHBand="0" w:firstRowFirstColumn="0" w:firstRowLastColumn="0" w:lastRowFirstColumn="0" w:lastRowLastColumn="0"/>
             </w:pPr>
+            <w:r>
+              <w:t>255.255.240.0</w:t>
+            </w:r>
           </w:p>
         </w:tc>
       </w:tr>
@@ -8351,6 +8357,9 @@
               <w:pStyle w:val="Code"/>
               <w:cnfStyle w:val="000000000000" w:firstRow="0" w:lastRow="0" w:firstColumn="0" w:lastColumn="0" w:oddVBand="0" w:evenVBand="0" w:oddHBand="0" w:evenHBand="0" w:firstRowFirstColumn="0" w:firstRowLastColumn="0" w:lastRowFirstColumn="0" w:lastRowLastColumn="0"/>
             </w:pPr>
+            <w:r>
+              <w:t>115.123.208.0</w:t>
+            </w:r>
           </w:p>
         </w:tc>
       </w:tr>
@@ -8389,6 +8398,9 @@
               <w:pStyle w:val="Code"/>
               <w:cnfStyle w:val="000000100000" w:firstRow="0" w:lastRow="0" w:firstColumn="0" w:lastColumn="0" w:oddVBand="0" w:evenVBand="0" w:oddHBand="1" w:evenHBand="0" w:firstRowFirstColumn="0" w:firstRowLastColumn="0" w:lastRowFirstColumn="0" w:lastRowLastColumn="0"/>
             </w:pPr>
+            <w:r>
+              <w:t>115.123.208.1 - 115.123.223.254</w:t>
+            </w:r>
           </w:p>
         </w:tc>
       </w:tr>
@@ -8424,6 +8436,9 @@
               <w:pStyle w:val="Code"/>
               <w:cnfStyle w:val="000000000000" w:firstRow="0" w:lastRow="0" w:firstColumn="0" w:lastColumn="0" w:oddVBand="0" w:evenVBand="0" w:oddHBand="0" w:evenHBand="0" w:firstRowFirstColumn="0" w:firstRowLastColumn="0" w:lastRowFirstColumn="0" w:lastRowLastColumn="0"/>
             </w:pPr>
+            <w:r>
+              <w:t>115.123.223.255</w:t>
+            </w:r>
           </w:p>
         </w:tc>
       </w:tr>
@@ -8462,6 +8477,9 @@
               <w:pStyle w:val="Code"/>
               <w:cnfStyle w:val="000000100000" w:firstRow="0" w:lastRow="0" w:firstColumn="0" w:lastColumn="0" w:oddVBand="0" w:evenVBand="0" w:oddHBand="1" w:evenHBand="0" w:firstRowFirstColumn="0" w:firstRowLastColumn="0" w:lastRowFirstColumn="0" w:lastRowLastColumn="0"/>
             </w:pPr>
+            <w:r>
+              <w:t>4,094</w:t>
+            </w:r>
           </w:p>
         </w:tc>
       </w:tr>
@@ -9456,6 +9474,9 @@
               <w:ind w:left="0"/>
               <w:cnfStyle w:val="000000100000" w:firstRow="0" w:lastRow="0" w:firstColumn="0" w:lastColumn="0" w:oddVBand="0" w:evenVBand="0" w:oddHBand="1" w:evenHBand="0" w:firstRowFirstColumn="0" w:firstRowLastColumn="0" w:lastRowFirstColumn="0" w:lastRowLastColumn="0"/>
             </w:pPr>
+            <w:r>
+              <w:t>hôte</w:t>
+            </w:r>
           </w:p>
         </w:tc>
       </w:tr>
@@ -9487,6 +9508,9 @@
               <w:ind w:left="0"/>
               <w:cnfStyle w:val="000000000000" w:firstRow="0" w:lastRow="0" w:firstColumn="0" w:lastColumn="0" w:oddVBand="0" w:evenVBand="0" w:oddHBand="0" w:evenHBand="0" w:firstRowFirstColumn="0" w:firstRowLastColumn="0" w:lastRowFirstColumn="0" w:lastRowLastColumn="0"/>
             </w:pPr>
+            <w:r>
+              <w:t>hôte</w:t>
+            </w:r>
           </w:p>
         </w:tc>
       </w:tr>
@@ -9521,6 +9545,9 @@
               <w:ind w:left="0"/>
               <w:cnfStyle w:val="000000100000" w:firstRow="0" w:lastRow="0" w:firstColumn="0" w:lastColumn="0" w:oddVBand="0" w:evenVBand="0" w:oddHBand="1" w:evenHBand="0" w:firstRowFirstColumn="0" w:firstRowLastColumn="0" w:lastRowFirstColumn="0" w:lastRowLastColumn="0"/>
             </w:pPr>
+            <w:r>
+              <w:t>hôte</w:t>
+            </w:r>
           </w:p>
         </w:tc>
       </w:tr>
@@ -9552,6 +9579,9 @@
               <w:ind w:left="0"/>
               <w:cnfStyle w:val="000000000000" w:firstRow="0" w:lastRow="0" w:firstColumn="0" w:lastColumn="0" w:oddVBand="0" w:evenVBand="0" w:oddHBand="0" w:evenHBand="0" w:firstRowFirstColumn="0" w:firstRowLastColumn="0" w:lastRowFirstColumn="0" w:lastRowLastColumn="0"/>
             </w:pPr>
+            <w:r>
+              <w:t>hôte</w:t>
+            </w:r>
           </w:p>
         </w:tc>
       </w:tr>
@@ -9586,6 +9616,9 @@
               <w:ind w:left="0"/>
               <w:cnfStyle w:val="000000100000" w:firstRow="0" w:lastRow="0" w:firstColumn="0" w:lastColumn="0" w:oddVBand="0" w:evenVBand="0" w:oddHBand="1" w:evenHBand="0" w:firstRowFirstColumn="0" w:firstRowLastColumn="0" w:lastRowFirstColumn="0" w:lastRowLastColumn="0"/>
             </w:pPr>
+            <w:r>
+              <w:t>hôte</w:t>
+            </w:r>
           </w:p>
         </w:tc>
       </w:tr>
@@ -9681,6 +9714,9 @@
               <w:ind w:left="0"/>
               <w:cnfStyle w:val="000000100000" w:firstRow="0" w:lastRow="0" w:firstColumn="0" w:lastColumn="0" w:oddVBand="0" w:evenVBand="0" w:oddHBand="1" w:evenHBand="0" w:firstRowFirstColumn="0" w:firstRowLastColumn="0" w:lastRowFirstColumn="0" w:lastRowLastColumn="0"/>
             </w:pPr>
+            <w:r>
+              <w:t>hôte</w:t>
+            </w:r>
           </w:p>
         </w:tc>
       </w:tr>
@@ -9715,6 +9751,9 @@
               <w:ind w:left="0"/>
               <w:cnfStyle w:val="000000000000" w:firstRow="0" w:lastRow="0" w:firstColumn="0" w:lastColumn="0" w:oddVBand="0" w:evenVBand="0" w:oddHBand="0" w:evenHBand="0" w:firstRowFirstColumn="0" w:firstRowLastColumn="0" w:lastRowFirstColumn="0" w:lastRowLastColumn="0"/>
             </w:pPr>
+            <w:r>
+              <w:t>hôte</w:t>
+            </w:r>
           </w:p>
         </w:tc>
       </w:tr>
@@ -9752,6 +9791,9 @@
               <w:ind w:left="0"/>
               <w:cnfStyle w:val="000000100000" w:firstRow="0" w:lastRow="0" w:firstColumn="0" w:lastColumn="0" w:oddVBand="0" w:evenVBand="0" w:oddHBand="1" w:evenHBand="0" w:firstRowFirstColumn="0" w:firstRowLastColumn="0" w:lastRowFirstColumn="0" w:lastRowLastColumn="0"/>
             </w:pPr>
+            <w:r>
+              <w:t>hôte</w:t>
+            </w:r>
           </w:p>
         </w:tc>
       </w:tr>
@@ -9786,6 +9828,9 @@
               <w:ind w:left="0"/>
               <w:cnfStyle w:val="000000000000" w:firstRow="0" w:lastRow="0" w:firstColumn="0" w:lastColumn="0" w:oddVBand="0" w:evenVBand="0" w:oddHBand="0" w:evenHBand="0" w:firstRowFirstColumn="0" w:firstRowLastColumn="0" w:lastRowFirstColumn="0" w:lastRowLastColumn="0"/>
             </w:pPr>
+            <w:r>
+              <w:t>hôte</w:t>
+            </w:r>
           </w:p>
         </w:tc>
       </w:tr>
@@ -9823,6 +9868,9 @@
               <w:ind w:left="0"/>
               <w:cnfStyle w:val="000000100000" w:firstRow="0" w:lastRow="0" w:firstColumn="0" w:lastColumn="0" w:oddVBand="0" w:evenVBand="0" w:oddHBand="1" w:evenHBand="0" w:firstRowFirstColumn="0" w:firstRowLastColumn="0" w:lastRowFirstColumn="0" w:lastRowLastColumn="0"/>
             </w:pPr>
+            <w:r>
+              <w:t>hôte</w:t>
+            </w:r>
           </w:p>
         </w:tc>
       </w:tr>
@@ -10135,7 +10183,19 @@
           <w:rPr>
             <w:rStyle w:val="Lienhypertexte"/>
           </w:rPr>
-          <w:t>https://en.wikipedia.org/wiki/Reserved_IP_addresses</w:t>
+          <w:t>https://en.wikipedia.org/wiki/Reserve</w:t>
+        </w:r>
+        <w:r>
+          <w:rPr>
+            <w:rStyle w:val="Lienhypertexte"/>
+          </w:rPr>
+          <w:t>d</w:t>
+        </w:r>
+        <w:r>
+          <w:rPr>
+            <w:rStyle w:val="Lienhypertexte"/>
+          </w:rPr>
+          <w:t>_IP_addresses</w:t>
         </w:r>
       </w:hyperlink>
       <w:r>
@@ -10207,7 +10267,19 @@
           <w:rPr>
             <w:rStyle w:val="Lienhypertexte"/>
           </w:rPr>
-          <w:t>https://ip-geolocation.whoisxmlapi.com/statistics</w:t>
+          <w:t>https://ip-geolocation.whoisxmlapi.c</w:t>
+        </w:r>
+        <w:r>
+          <w:rPr>
+            <w:rStyle w:val="Lienhypertexte"/>
+          </w:rPr>
+          <w:t>o</w:t>
+        </w:r>
+        <w:r>
+          <w:rPr>
+            <w:rStyle w:val="Lienhypertexte"/>
+          </w:rPr>
+          <w:t>m/statistics</w:t>
         </w:r>
       </w:hyperlink>
     </w:p>
@@ -10264,7 +10336,19 @@
           <w:rPr>
             <w:rStyle w:val="Lienhypertexte"/>
           </w:rPr>
-          <w:t>https://iplocation.io/</w:t>
+          <w:t>https://iplocati</w:t>
+        </w:r>
+        <w:r>
+          <w:rPr>
+            <w:rStyle w:val="Lienhypertexte"/>
+          </w:rPr>
+          <w:t>o</w:t>
+        </w:r>
+        <w:r>
+          <w:rPr>
+            <w:rStyle w:val="Lienhypertexte"/>
+          </w:rPr>
+          <w:t>n.io/</w:t>
         </w:r>
       </w:hyperlink>
     </w:p>
@@ -10942,6 +11026,9 @@
               <w:jc w:val="center"/>
               <w:cnfStyle w:val="000000000000" w:firstRow="0" w:lastRow="0" w:firstColumn="0" w:lastColumn="0" w:oddVBand="0" w:evenVBand="0" w:oddHBand="0" w:evenHBand="0" w:firstRowFirstColumn="0" w:firstRowLastColumn="0" w:lastRowFirstColumn="0" w:lastRowLastColumn="0"/>
             </w:pPr>
+            <w:r>
+              <w:t>Réservé</w:t>
+            </w:r>
           </w:p>
         </w:tc>
       </w:tr>
@@ -10976,6 +11063,9 @@
               <w:jc w:val="center"/>
               <w:cnfStyle w:val="000000100000" w:firstRow="0" w:lastRow="0" w:firstColumn="0" w:lastColumn="0" w:oddVBand="0" w:evenVBand="0" w:oddHBand="1" w:evenHBand="0" w:firstRowFirstColumn="0" w:firstRowLastColumn="0" w:lastRowFirstColumn="0" w:lastRowLastColumn="0"/>
             </w:pPr>
+            <w:r>
+              <w:t>Locale</w:t>
+            </w:r>
           </w:p>
         </w:tc>
       </w:tr>
@@ -11007,6 +11097,9 @@
               <w:jc w:val="center"/>
               <w:cnfStyle w:val="000000000000" w:firstRow="0" w:lastRow="0" w:firstColumn="0" w:lastColumn="0" w:oddVBand="0" w:evenVBand="0" w:oddHBand="0" w:evenHBand="0" w:firstRowFirstColumn="0" w:firstRowLastColumn="0" w:lastRowFirstColumn="0" w:lastRowLastColumn="0"/>
             </w:pPr>
+            <w:r>
+              <w:t>Réservé</w:t>
+            </w:r>
           </w:p>
         </w:tc>
       </w:tr>
@@ -11041,6 +11134,9 @@
               <w:jc w:val="center"/>
               <w:cnfStyle w:val="000000100000" w:firstRow="0" w:lastRow="0" w:firstColumn="0" w:lastColumn="0" w:oddVBand="0" w:evenVBand="0" w:oddHBand="1" w:evenHBand="0" w:firstRowFirstColumn="0" w:firstRowLastColumn="0" w:lastRowFirstColumn="0" w:lastRowLastColumn="0"/>
             </w:pPr>
+            <w:r>
+              <w:t>Locale</w:t>
+            </w:r>
           </w:p>
         </w:tc>
       </w:tr>
@@ -11071,7 +11167,16 @@
               <w:pStyle w:val="Code"/>
               <w:jc w:val="center"/>
               <w:cnfStyle w:val="000000000000" w:firstRow="0" w:lastRow="0" w:firstColumn="0" w:lastColumn="0" w:oddVBand="0" w:evenVBand="0" w:oddHBand="0" w:evenHBand="0" w:firstRowFirstColumn="0" w:firstRowLastColumn="0" w:lastRowFirstColumn="0" w:lastRowLastColumn="0"/>
-            </w:pPr>
+              <w:rPr>
+                <w:lang w:val="en-CA"/>
+              </w:rPr>
+            </w:pPr>
+            <w:r>
+              <w:rPr>
+                <w:lang w:val="en-CA"/>
+              </w:rPr>
+              <w:t>Public (United State of America)</w:t>
+            </w:r>
           </w:p>
         </w:tc>
       </w:tr>
@@ -11105,7 +11210,28 @@
               <w:pStyle w:val="Code"/>
               <w:jc w:val="center"/>
               <w:cnfStyle w:val="000000100000" w:firstRow="0" w:lastRow="0" w:firstColumn="0" w:lastColumn="0" w:oddVBand="0" w:evenVBand="0" w:oddHBand="1" w:evenHBand="0" w:firstRowFirstColumn="0" w:firstRowLastColumn="0" w:lastRowFirstColumn="0" w:lastRowLastColumn="0"/>
-            </w:pPr>
+              <w:rPr>
+                <w:lang w:val="en-CA"/>
+              </w:rPr>
+            </w:pPr>
+            <w:r>
+              <w:rPr>
+                <w:lang w:val="en-CA"/>
+              </w:rPr>
+              <w:t>Public (</w:t>
+            </w:r>
+            <w:r>
+              <w:rPr>
+                <w:lang w:val="en-CA"/>
+              </w:rPr>
+              <w:t> United States of America</w:t>
+            </w:r>
+            <w:r>
+              <w:rPr>
+                <w:lang w:val="en-CA"/>
+              </w:rPr>
+              <w:t>)</w:t>
+            </w:r>
           </w:p>
         </w:tc>
       </w:tr>
@@ -11137,6 +11263,9 @@
               <w:jc w:val="center"/>
               <w:cnfStyle w:val="000000000000" w:firstRow="0" w:lastRow="0" w:firstColumn="0" w:lastColumn="0" w:oddVBand="0" w:evenVBand="0" w:oddHBand="0" w:evenHBand="0" w:firstRowFirstColumn="0" w:firstRowLastColumn="0" w:lastRowFirstColumn="0" w:lastRowLastColumn="0"/>
             </w:pPr>
+            <w:r>
+              <w:t>Public (Japan)</w:t>
+            </w:r>
           </w:p>
         </w:tc>
       </w:tr>
@@ -16030,6 +16159,12 @@
                 <w:highlight w:val="yellow"/>
               </w:rPr>
             </w:pPr>
+            <w:r>
+              <w:rPr>
+                <w:highlight w:val="yellow"/>
+              </w:rPr>
+              <w:t>4</w:t>
+            </w:r>
           </w:p>
         </w:tc>
       </w:tr>
@@ -16068,6 +16203,12 @@
                 <w:highlight w:val="yellow"/>
               </w:rPr>
             </w:pPr>
+            <w:r>
+              <w:rPr>
+                <w:highlight w:val="yellow"/>
+              </w:rPr>
+              <w:t>2</w:t>
+            </w:r>
           </w:p>
         </w:tc>
       </w:tr>
@@ -16103,6 +16244,12 @@
                 <w:highlight w:val="yellow"/>
               </w:rPr>
             </w:pPr>
+            <w:r>
+              <w:rPr>
+                <w:highlight w:val="yellow"/>
+              </w:rPr>
+              <w:t>/26 + 2 = /28</w:t>
+            </w:r>
           </w:p>
         </w:tc>
       </w:tr>
@@ -16142,6 +16289,48 @@
                 <w:highlight w:val="yellow"/>
               </w:rPr>
             </w:pPr>
+            <w:r>
+              <w:rPr>
+                <w:highlight w:val="yellow"/>
+              </w:rPr>
+              <w:t>192.168.140.0</w:t>
+            </w:r>
+            <w:r>
+              <w:rPr>
+                <w:highlight w:val="yellow"/>
+              </w:rPr>
+              <w:t>/28</w:t>
+            </w:r>
+          </w:p>
+          <w:p>
+            <w:pPr>
+              <w:pStyle w:val="Code"/>
+              <w:cnfStyle w:val="000000100000" w:firstRow="0" w:lastRow="0" w:firstColumn="0" w:lastColumn="0" w:oddVBand="0" w:evenVBand="0" w:oddHBand="1" w:evenHBand="0" w:firstRowFirstColumn="0" w:firstRowLastColumn="0" w:lastRowFirstColumn="0" w:lastRowLastColumn="0"/>
+              <w:rPr>
+                <w:highlight w:val="yellow"/>
+              </w:rPr>
+            </w:pPr>
+            <w:r>
+              <w:rPr>
+                <w:highlight w:val="yellow"/>
+              </w:rPr>
+              <w:t>192.168.140.16</w:t>
+            </w:r>
+          </w:p>
+          <w:p>
+            <w:pPr>
+              <w:pStyle w:val="Code"/>
+              <w:cnfStyle w:val="000000100000" w:firstRow="0" w:lastRow="0" w:firstColumn="0" w:lastColumn="0" w:oddVBand="0" w:evenVBand="0" w:oddHBand="1" w:evenHBand="0" w:firstRowFirstColumn="0" w:firstRowLastColumn="0" w:lastRowFirstColumn="0" w:lastRowLastColumn="0"/>
+              <w:rPr>
+                <w:highlight w:val="yellow"/>
+              </w:rPr>
+            </w:pPr>
+            <w:r>
+              <w:rPr>
+                <w:highlight w:val="yellow"/>
+              </w:rPr>
+              <w:t>192.168.140.32</w:t>
+            </w:r>
           </w:p>
         </w:tc>
       </w:tr>
@@ -16180,6 +16369,270 @@
                 <w:highlight w:val="yellow"/>
               </w:rPr>
             </w:pPr>
+            <w:r>
+              <w:rPr>
+                <w:highlight w:val="yellow"/>
+              </w:rPr>
+              <w:t>192.168.140.48</w:t>
+            </w:r>
+            <w:r>
+              <w:rPr>
+                <w:highlight w:val="yellow"/>
+              </w:rPr>
+              <w:t>/28</w:t>
+            </w:r>
+          </w:p>
+          <w:p>
+            <w:pPr>
+              <w:pStyle w:val="Code"/>
+              <w:cnfStyle w:val="000000000000" w:firstRow="0" w:lastRow="0" w:firstColumn="0" w:lastColumn="0" w:oddVBand="0" w:evenVBand="0" w:oddHBand="0" w:evenHBand="0" w:firstRowFirstColumn="0" w:firstRowLastColumn="0" w:lastRowFirstColumn="0" w:lastRowLastColumn="0"/>
+              <w:rPr>
+                <w:highlight w:val="yellow"/>
+              </w:rPr>
+            </w:pPr>
+            <w:r>
+              <w:rPr>
+                <w:highlight w:val="yellow"/>
+              </w:rPr>
+              <w:t>192.168.140.64</w:t>
+            </w:r>
+            <w:r>
+              <w:rPr>
+                <w:highlight w:val="yellow"/>
+              </w:rPr>
+              <w:t>/28</w:t>
+            </w:r>
+          </w:p>
+          <w:p>
+            <w:pPr>
+              <w:pStyle w:val="Code"/>
+              <w:cnfStyle w:val="000000000000" w:firstRow="0" w:lastRow="0" w:firstColumn="0" w:lastColumn="0" w:oddVBand="0" w:evenVBand="0" w:oddHBand="0" w:evenHBand="0" w:firstRowFirstColumn="0" w:firstRowLastColumn="0" w:lastRowFirstColumn="0" w:lastRowLastColumn="0"/>
+              <w:rPr>
+                <w:highlight w:val="yellow"/>
+              </w:rPr>
+            </w:pPr>
+            <w:r>
+              <w:rPr>
+                <w:highlight w:val="yellow"/>
+              </w:rPr>
+              <w:t>192.168.140.80</w:t>
+            </w:r>
+            <w:r>
+              <w:rPr>
+                <w:highlight w:val="yellow"/>
+              </w:rPr>
+              <w:t>/28</w:t>
+            </w:r>
+          </w:p>
+          <w:p>
+            <w:pPr>
+              <w:pStyle w:val="Code"/>
+              <w:cnfStyle w:val="000000000000" w:firstRow="0" w:lastRow="0" w:firstColumn="0" w:lastColumn="0" w:oddVBand="0" w:evenVBand="0" w:oddHBand="0" w:evenHBand="0" w:firstRowFirstColumn="0" w:firstRowLastColumn="0" w:lastRowFirstColumn="0" w:lastRowLastColumn="0"/>
+              <w:rPr>
+                <w:highlight w:val="yellow"/>
+              </w:rPr>
+            </w:pPr>
+            <w:r>
+              <w:rPr>
+                <w:highlight w:val="yellow"/>
+              </w:rPr>
+              <w:t>192.168.140.96</w:t>
+            </w:r>
+            <w:r>
+              <w:rPr>
+                <w:highlight w:val="yellow"/>
+              </w:rPr>
+              <w:t>/28</w:t>
+            </w:r>
+          </w:p>
+          <w:p>
+            <w:pPr>
+              <w:pStyle w:val="Code"/>
+              <w:cnfStyle w:val="000000000000" w:firstRow="0" w:lastRow="0" w:firstColumn="0" w:lastColumn="0" w:oddVBand="0" w:evenVBand="0" w:oddHBand="0" w:evenHBand="0" w:firstRowFirstColumn="0" w:firstRowLastColumn="0" w:lastRowFirstColumn="0" w:lastRowLastColumn="0"/>
+              <w:rPr>
+                <w:highlight w:val="yellow"/>
+              </w:rPr>
+            </w:pPr>
+            <w:r>
+              <w:rPr>
+                <w:highlight w:val="yellow"/>
+              </w:rPr>
+              <w:t>192.168.140.112</w:t>
+            </w:r>
+            <w:r>
+              <w:rPr>
+                <w:highlight w:val="yellow"/>
+              </w:rPr>
+              <w:t>/28</w:t>
+            </w:r>
+          </w:p>
+          <w:p>
+            <w:pPr>
+              <w:pStyle w:val="Code"/>
+              <w:cnfStyle w:val="000000000000" w:firstRow="0" w:lastRow="0" w:firstColumn="0" w:lastColumn="0" w:oddVBand="0" w:evenVBand="0" w:oddHBand="0" w:evenHBand="0" w:firstRowFirstColumn="0" w:firstRowLastColumn="0" w:lastRowFirstColumn="0" w:lastRowLastColumn="0"/>
+              <w:rPr>
+                <w:highlight w:val="yellow"/>
+              </w:rPr>
+            </w:pPr>
+            <w:r>
+              <w:rPr>
+                <w:highlight w:val="yellow"/>
+              </w:rPr>
+              <w:t>192.168.140.128</w:t>
+            </w:r>
+            <w:r>
+              <w:rPr>
+                <w:highlight w:val="yellow"/>
+              </w:rPr>
+              <w:t>/28</w:t>
+            </w:r>
+          </w:p>
+          <w:p>
+            <w:pPr>
+              <w:pStyle w:val="Code"/>
+              <w:cnfStyle w:val="000000000000" w:firstRow="0" w:lastRow="0" w:firstColumn="0" w:lastColumn="0" w:oddVBand="0" w:evenVBand="0" w:oddHBand="0" w:evenHBand="0" w:firstRowFirstColumn="0" w:firstRowLastColumn="0" w:lastRowFirstColumn="0" w:lastRowLastColumn="0"/>
+              <w:rPr>
+                <w:highlight w:val="yellow"/>
+              </w:rPr>
+            </w:pPr>
+            <w:r>
+              <w:rPr>
+                <w:highlight w:val="yellow"/>
+              </w:rPr>
+              <w:t>192.168.140.144</w:t>
+            </w:r>
+            <w:r>
+              <w:rPr>
+                <w:highlight w:val="yellow"/>
+              </w:rPr>
+              <w:t>/28</w:t>
+            </w:r>
+          </w:p>
+          <w:p>
+            <w:pPr>
+              <w:pStyle w:val="Code"/>
+              <w:cnfStyle w:val="000000000000" w:firstRow="0" w:lastRow="0" w:firstColumn="0" w:lastColumn="0" w:oddVBand="0" w:evenVBand="0" w:oddHBand="0" w:evenHBand="0" w:firstRowFirstColumn="0" w:firstRowLastColumn="0" w:lastRowFirstColumn="0" w:lastRowLastColumn="0"/>
+              <w:rPr>
+                <w:highlight w:val="yellow"/>
+              </w:rPr>
+            </w:pPr>
+            <w:r>
+              <w:rPr>
+                <w:highlight w:val="yellow"/>
+              </w:rPr>
+              <w:t>192.168.140.160</w:t>
+            </w:r>
+            <w:r>
+              <w:rPr>
+                <w:highlight w:val="yellow"/>
+              </w:rPr>
+              <w:t>/28</w:t>
+            </w:r>
+          </w:p>
+          <w:p>
+            <w:pPr>
+              <w:pStyle w:val="Code"/>
+              <w:cnfStyle w:val="000000000000" w:firstRow="0" w:lastRow="0" w:firstColumn="0" w:lastColumn="0" w:oddVBand="0" w:evenVBand="0" w:oddHBand="0" w:evenHBand="0" w:firstRowFirstColumn="0" w:firstRowLastColumn="0" w:lastRowFirstColumn="0" w:lastRowLastColumn="0"/>
+              <w:rPr>
+                <w:highlight w:val="yellow"/>
+              </w:rPr>
+            </w:pPr>
+            <w:r>
+              <w:rPr>
+                <w:highlight w:val="yellow"/>
+              </w:rPr>
+              <w:t>192.168.140.176</w:t>
+            </w:r>
+            <w:r>
+              <w:rPr>
+                <w:highlight w:val="yellow"/>
+              </w:rPr>
+              <w:t>/28</w:t>
+            </w:r>
+          </w:p>
+          <w:p>
+            <w:pPr>
+              <w:pStyle w:val="Code"/>
+              <w:cnfStyle w:val="000000000000" w:firstRow="0" w:lastRow="0" w:firstColumn="0" w:lastColumn="0" w:oddVBand="0" w:evenVBand="0" w:oddHBand="0" w:evenHBand="0" w:firstRowFirstColumn="0" w:firstRowLastColumn="0" w:lastRowFirstColumn="0" w:lastRowLastColumn="0"/>
+              <w:rPr>
+                <w:highlight w:val="yellow"/>
+              </w:rPr>
+            </w:pPr>
+            <w:r>
+              <w:rPr>
+                <w:highlight w:val="yellow"/>
+              </w:rPr>
+              <w:t>192.168.140.192</w:t>
+            </w:r>
+            <w:r>
+              <w:rPr>
+                <w:highlight w:val="yellow"/>
+              </w:rPr>
+              <w:t>/28</w:t>
+            </w:r>
+          </w:p>
+          <w:p>
+            <w:pPr>
+              <w:pStyle w:val="Code"/>
+              <w:cnfStyle w:val="000000000000" w:firstRow="0" w:lastRow="0" w:firstColumn="0" w:lastColumn="0" w:oddVBand="0" w:evenVBand="0" w:oddHBand="0" w:evenHBand="0" w:firstRowFirstColumn="0" w:firstRowLastColumn="0" w:lastRowFirstColumn="0" w:lastRowLastColumn="0"/>
+              <w:rPr>
+                <w:highlight w:val="yellow"/>
+              </w:rPr>
+            </w:pPr>
+            <w:r>
+              <w:rPr>
+                <w:highlight w:val="yellow"/>
+              </w:rPr>
+              <w:t>192.168.140.208</w:t>
+            </w:r>
+            <w:r>
+              <w:rPr>
+                <w:highlight w:val="yellow"/>
+              </w:rPr>
+              <w:t>/28</w:t>
+            </w:r>
+          </w:p>
+          <w:p>
+            <w:pPr>
+              <w:pStyle w:val="Code"/>
+              <w:cnfStyle w:val="000000000000" w:firstRow="0" w:lastRow="0" w:firstColumn="0" w:lastColumn="0" w:oddVBand="0" w:evenVBand="0" w:oddHBand="0" w:evenHBand="0" w:firstRowFirstColumn="0" w:firstRowLastColumn="0" w:lastRowFirstColumn="0" w:lastRowLastColumn="0"/>
+              <w:rPr>
+                <w:highlight w:val="yellow"/>
+              </w:rPr>
+            </w:pPr>
+            <w:r>
+              <w:rPr>
+                <w:highlight w:val="yellow"/>
+              </w:rPr>
+              <w:t>192.168.140.224</w:t>
+            </w:r>
+            <w:r>
+              <w:rPr>
+                <w:highlight w:val="yellow"/>
+              </w:rPr>
+              <w:t>/28</w:t>
+            </w:r>
+          </w:p>
+          <w:p>
+            <w:pPr>
+              <w:pStyle w:val="Code"/>
+              <w:cnfStyle w:val="000000000000" w:firstRow="0" w:lastRow="0" w:firstColumn="0" w:lastColumn="0" w:oddVBand="0" w:evenVBand="0" w:oddHBand="0" w:evenHBand="0" w:firstRowFirstColumn="0" w:firstRowLastColumn="0" w:lastRowFirstColumn="0" w:lastRowLastColumn="0"/>
+              <w:rPr>
+                <w:highlight w:val="yellow"/>
+              </w:rPr>
+            </w:pPr>
+            <w:r>
+              <w:rPr>
+                <w:highlight w:val="yellow"/>
+              </w:rPr>
+              <w:t>192.168.140.240</w:t>
+            </w:r>
+            <w:r>
+              <w:rPr>
+                <w:highlight w:val="yellow"/>
+              </w:rPr>
+              <w:t>/28</w:t>
+            </w:r>
           </w:p>
         </w:tc>
       </w:tr>
@@ -16216,6 +16669,9 @@
                 <w:highlight w:val="yellow"/>
               </w:rPr>
             </w:pPr>
+            <w:r>
+              <w:t>255.255.255.240</w:t>
+            </w:r>
           </w:p>
         </w:tc>
       </w:tr>
@@ -16251,6 +16707,12 @@
                 <w:highlight w:val="yellow"/>
               </w:rPr>
             </w:pPr>
+            <w:r>
+              <w:rPr>
+                <w:highlight w:val="yellow"/>
+              </w:rPr>
+              <w:t>14</w:t>
+            </w:r>
           </w:p>
         </w:tc>
       </w:tr>
@@ -16391,6 +16853,12 @@
                 <w:highlight w:val="yellow"/>
               </w:rPr>
             </w:pPr>
+            <w:r>
+              <w:rPr>
+                <w:highlight w:val="yellow"/>
+              </w:rPr>
+              <w:t>16</w:t>
+            </w:r>
           </w:p>
         </w:tc>
       </w:tr>
@@ -16429,6 +16897,12 @@
                 <w:highlight w:val="yellow"/>
               </w:rPr>
             </w:pPr>
+            <w:r>
+              <w:rPr>
+                <w:highlight w:val="yellow"/>
+              </w:rPr>
+              <w:t>4</w:t>
+            </w:r>
           </w:p>
         </w:tc>
       </w:tr>
@@ -16464,6 +16938,12 @@
                 <w:highlight w:val="yellow"/>
               </w:rPr>
             </w:pPr>
+            <w:r>
+              <w:rPr>
+                <w:highlight w:val="yellow"/>
+              </w:rPr>
+              <w:t>/24 + 4 = 28</w:t>
+            </w:r>
           </w:p>
         </w:tc>
       </w:tr>
@@ -16503,6 +16983,270 @@
                 <w:highlight w:val="yellow"/>
               </w:rPr>
             </w:pPr>
+            <w:r>
+              <w:rPr>
+                <w:highlight w:val="yellow"/>
+              </w:rPr>
+              <w:t>172.18.188.0</w:t>
+            </w:r>
+            <w:r>
+              <w:rPr>
+                <w:highlight w:val="yellow"/>
+              </w:rPr>
+              <w:t>/28</w:t>
+            </w:r>
+          </w:p>
+          <w:p>
+            <w:pPr>
+              <w:pStyle w:val="Code"/>
+              <w:cnfStyle w:val="000000100000" w:firstRow="0" w:lastRow="0" w:firstColumn="0" w:lastColumn="0" w:oddVBand="0" w:evenVBand="0" w:oddHBand="1" w:evenHBand="0" w:firstRowFirstColumn="0" w:firstRowLastColumn="0" w:lastRowFirstColumn="0" w:lastRowLastColumn="0"/>
+              <w:rPr>
+                <w:highlight w:val="yellow"/>
+              </w:rPr>
+            </w:pPr>
+            <w:r>
+              <w:rPr>
+                <w:highlight w:val="yellow"/>
+              </w:rPr>
+              <w:t>172.18.188.16</w:t>
+            </w:r>
+            <w:r>
+              <w:rPr>
+                <w:highlight w:val="yellow"/>
+              </w:rPr>
+              <w:t>/28</w:t>
+            </w:r>
+          </w:p>
+          <w:p>
+            <w:pPr>
+              <w:pStyle w:val="Code"/>
+              <w:cnfStyle w:val="000000100000" w:firstRow="0" w:lastRow="0" w:firstColumn="0" w:lastColumn="0" w:oddVBand="0" w:evenVBand="0" w:oddHBand="1" w:evenHBand="0" w:firstRowFirstColumn="0" w:firstRowLastColumn="0" w:lastRowFirstColumn="0" w:lastRowLastColumn="0"/>
+              <w:rPr>
+                <w:highlight w:val="yellow"/>
+              </w:rPr>
+            </w:pPr>
+            <w:r>
+              <w:rPr>
+                <w:highlight w:val="yellow"/>
+              </w:rPr>
+              <w:t>172.18.188.32</w:t>
+            </w:r>
+            <w:r>
+              <w:rPr>
+                <w:highlight w:val="yellow"/>
+              </w:rPr>
+              <w:t>/28</w:t>
+            </w:r>
+          </w:p>
+          <w:p>
+            <w:pPr>
+              <w:pStyle w:val="Code"/>
+              <w:cnfStyle w:val="000000100000" w:firstRow="0" w:lastRow="0" w:firstColumn="0" w:lastColumn="0" w:oddVBand="0" w:evenVBand="0" w:oddHBand="1" w:evenHBand="0" w:firstRowFirstColumn="0" w:firstRowLastColumn="0" w:lastRowFirstColumn="0" w:lastRowLastColumn="0"/>
+              <w:rPr>
+                <w:highlight w:val="yellow"/>
+              </w:rPr>
+            </w:pPr>
+            <w:r>
+              <w:rPr>
+                <w:highlight w:val="yellow"/>
+              </w:rPr>
+              <w:t>172.18.188.48</w:t>
+            </w:r>
+            <w:r>
+              <w:rPr>
+                <w:highlight w:val="yellow"/>
+              </w:rPr>
+              <w:t>/28</w:t>
+            </w:r>
+          </w:p>
+          <w:p>
+            <w:pPr>
+              <w:pStyle w:val="Code"/>
+              <w:cnfStyle w:val="000000100000" w:firstRow="0" w:lastRow="0" w:firstColumn="0" w:lastColumn="0" w:oddVBand="0" w:evenVBand="0" w:oddHBand="1" w:evenHBand="0" w:firstRowFirstColumn="0" w:firstRowLastColumn="0" w:lastRowFirstColumn="0" w:lastRowLastColumn="0"/>
+              <w:rPr>
+                <w:highlight w:val="yellow"/>
+              </w:rPr>
+            </w:pPr>
+            <w:r>
+              <w:rPr>
+                <w:highlight w:val="yellow"/>
+              </w:rPr>
+              <w:t>172.18.188.64</w:t>
+            </w:r>
+            <w:r>
+              <w:rPr>
+                <w:highlight w:val="yellow"/>
+              </w:rPr>
+              <w:t>/28</w:t>
+            </w:r>
+          </w:p>
+          <w:p>
+            <w:pPr>
+              <w:pStyle w:val="Code"/>
+              <w:cnfStyle w:val="000000100000" w:firstRow="0" w:lastRow="0" w:firstColumn="0" w:lastColumn="0" w:oddVBand="0" w:evenVBand="0" w:oddHBand="1" w:evenHBand="0" w:firstRowFirstColumn="0" w:firstRowLastColumn="0" w:lastRowFirstColumn="0" w:lastRowLastColumn="0"/>
+              <w:rPr>
+                <w:highlight w:val="yellow"/>
+              </w:rPr>
+            </w:pPr>
+            <w:r>
+              <w:rPr>
+                <w:highlight w:val="yellow"/>
+              </w:rPr>
+              <w:t>172.18.188.80</w:t>
+            </w:r>
+            <w:r>
+              <w:rPr>
+                <w:highlight w:val="yellow"/>
+              </w:rPr>
+              <w:t>/28</w:t>
+            </w:r>
+          </w:p>
+          <w:p>
+            <w:pPr>
+              <w:pStyle w:val="Code"/>
+              <w:cnfStyle w:val="000000100000" w:firstRow="0" w:lastRow="0" w:firstColumn="0" w:lastColumn="0" w:oddVBand="0" w:evenVBand="0" w:oddHBand="1" w:evenHBand="0" w:firstRowFirstColumn="0" w:firstRowLastColumn="0" w:lastRowFirstColumn="0" w:lastRowLastColumn="0"/>
+              <w:rPr>
+                <w:highlight w:val="yellow"/>
+              </w:rPr>
+            </w:pPr>
+            <w:r>
+              <w:rPr>
+                <w:highlight w:val="yellow"/>
+              </w:rPr>
+              <w:t>172.18.188.96</w:t>
+            </w:r>
+            <w:r>
+              <w:rPr>
+                <w:highlight w:val="yellow"/>
+              </w:rPr>
+              <w:t>/28</w:t>
+            </w:r>
+          </w:p>
+          <w:p>
+            <w:pPr>
+              <w:pStyle w:val="Code"/>
+              <w:cnfStyle w:val="000000100000" w:firstRow="0" w:lastRow="0" w:firstColumn="0" w:lastColumn="0" w:oddVBand="0" w:evenVBand="0" w:oddHBand="1" w:evenHBand="0" w:firstRowFirstColumn="0" w:firstRowLastColumn="0" w:lastRowFirstColumn="0" w:lastRowLastColumn="0"/>
+              <w:rPr>
+                <w:highlight w:val="yellow"/>
+              </w:rPr>
+            </w:pPr>
+            <w:r>
+              <w:rPr>
+                <w:highlight w:val="yellow"/>
+              </w:rPr>
+              <w:t>172.18.188.112</w:t>
+            </w:r>
+            <w:r>
+              <w:rPr>
+                <w:highlight w:val="yellow"/>
+              </w:rPr>
+              <w:t>/28</w:t>
+            </w:r>
+          </w:p>
+          <w:p>
+            <w:pPr>
+              <w:pStyle w:val="Code"/>
+              <w:cnfStyle w:val="000000100000" w:firstRow="0" w:lastRow="0" w:firstColumn="0" w:lastColumn="0" w:oddVBand="0" w:evenVBand="0" w:oddHBand="1" w:evenHBand="0" w:firstRowFirstColumn="0" w:firstRowLastColumn="0" w:lastRowFirstColumn="0" w:lastRowLastColumn="0"/>
+              <w:rPr>
+                <w:highlight w:val="yellow"/>
+              </w:rPr>
+            </w:pPr>
+            <w:r>
+              <w:rPr>
+                <w:highlight w:val="yellow"/>
+              </w:rPr>
+              <w:t>172.18.188.128</w:t>
+            </w:r>
+            <w:r>
+              <w:rPr>
+                <w:highlight w:val="yellow"/>
+              </w:rPr>
+              <w:t>/28</w:t>
+            </w:r>
+          </w:p>
+          <w:p>
+            <w:pPr>
+              <w:pStyle w:val="Code"/>
+              <w:cnfStyle w:val="000000100000" w:firstRow="0" w:lastRow="0" w:firstColumn="0" w:lastColumn="0" w:oddVBand="0" w:evenVBand="0" w:oddHBand="1" w:evenHBand="0" w:firstRowFirstColumn="0" w:firstRowLastColumn="0" w:lastRowFirstColumn="0" w:lastRowLastColumn="0"/>
+              <w:rPr>
+                <w:highlight w:val="yellow"/>
+              </w:rPr>
+            </w:pPr>
+            <w:r>
+              <w:rPr>
+                <w:highlight w:val="yellow"/>
+              </w:rPr>
+              <w:t>172.18.188.144</w:t>
+            </w:r>
+            <w:r>
+              <w:rPr>
+                <w:highlight w:val="yellow"/>
+              </w:rPr>
+              <w:t>/28</w:t>
+            </w:r>
+          </w:p>
+          <w:p>
+            <w:pPr>
+              <w:pStyle w:val="Code"/>
+              <w:cnfStyle w:val="000000100000" w:firstRow="0" w:lastRow="0" w:firstColumn="0" w:lastColumn="0" w:oddVBand="0" w:evenVBand="0" w:oddHBand="1" w:evenHBand="0" w:firstRowFirstColumn="0" w:firstRowLastColumn="0" w:lastRowFirstColumn="0" w:lastRowLastColumn="0"/>
+              <w:rPr>
+                <w:highlight w:val="yellow"/>
+              </w:rPr>
+            </w:pPr>
+            <w:r>
+              <w:rPr>
+                <w:highlight w:val="yellow"/>
+              </w:rPr>
+              <w:t>172.18.188.160</w:t>
+            </w:r>
+            <w:r>
+              <w:rPr>
+                <w:highlight w:val="yellow"/>
+              </w:rPr>
+              <w:t>/28</w:t>
+            </w:r>
+          </w:p>
+          <w:p>
+            <w:pPr>
+              <w:pStyle w:val="Code"/>
+              <w:cnfStyle w:val="000000100000" w:firstRow="0" w:lastRow="0" w:firstColumn="0" w:lastColumn="0" w:oddVBand="0" w:evenVBand="0" w:oddHBand="1" w:evenHBand="0" w:firstRowFirstColumn="0" w:firstRowLastColumn="0" w:lastRowFirstColumn="0" w:lastRowLastColumn="0"/>
+              <w:rPr>
+                <w:highlight w:val="yellow"/>
+              </w:rPr>
+            </w:pPr>
+            <w:r>
+              <w:rPr>
+                <w:highlight w:val="yellow"/>
+              </w:rPr>
+              <w:t>172.18.188.176</w:t>
+            </w:r>
+            <w:r>
+              <w:rPr>
+                <w:highlight w:val="yellow"/>
+              </w:rPr>
+              <w:t>/28</w:t>
+            </w:r>
+          </w:p>
+          <w:p>
+            <w:pPr>
+              <w:pStyle w:val="Code"/>
+              <w:cnfStyle w:val="000000100000" w:firstRow="0" w:lastRow="0" w:firstColumn="0" w:lastColumn="0" w:oddVBand="0" w:evenVBand="0" w:oddHBand="1" w:evenHBand="0" w:firstRowFirstColumn="0" w:firstRowLastColumn="0" w:lastRowFirstColumn="0" w:lastRowLastColumn="0"/>
+              <w:rPr>
+                <w:highlight w:val="yellow"/>
+              </w:rPr>
+            </w:pPr>
+            <w:r>
+              <w:rPr>
+                <w:highlight w:val="yellow"/>
+              </w:rPr>
+              <w:t>172.18.188.192</w:t>
+            </w:r>
+            <w:r>
+              <w:rPr>
+                <w:highlight w:val="yellow"/>
+              </w:rPr>
+              <w:t>/28</w:t>
+            </w:r>
           </w:p>
         </w:tc>
       </w:tr>
@@ -16541,6 +17285,60 @@
                 <w:highlight w:val="yellow"/>
               </w:rPr>
             </w:pPr>
+            <w:r>
+              <w:rPr>
+                <w:highlight w:val="yellow"/>
+              </w:rPr>
+              <w:t>172.18.188.208</w:t>
+            </w:r>
+            <w:r>
+              <w:rPr>
+                <w:highlight w:val="yellow"/>
+              </w:rPr>
+              <w:t>/28</w:t>
+            </w:r>
+          </w:p>
+          <w:p>
+            <w:pPr>
+              <w:pStyle w:val="Code"/>
+              <w:cnfStyle w:val="000000000000" w:firstRow="0" w:lastRow="0" w:firstColumn="0" w:lastColumn="0" w:oddVBand="0" w:evenVBand="0" w:oddHBand="0" w:evenHBand="0" w:firstRowFirstColumn="0" w:firstRowLastColumn="0" w:lastRowFirstColumn="0" w:lastRowLastColumn="0"/>
+              <w:rPr>
+                <w:highlight w:val="yellow"/>
+              </w:rPr>
+            </w:pPr>
+            <w:r>
+              <w:rPr>
+                <w:highlight w:val="yellow"/>
+              </w:rPr>
+              <w:t>172.18.188.224</w:t>
+            </w:r>
+            <w:r>
+              <w:rPr>
+                <w:highlight w:val="yellow"/>
+              </w:rPr>
+              <w:t>/28</w:t>
+            </w:r>
+          </w:p>
+          <w:p>
+            <w:pPr>
+              <w:pStyle w:val="Code"/>
+              <w:cnfStyle w:val="000000000000" w:firstRow="0" w:lastRow="0" w:firstColumn="0" w:lastColumn="0" w:oddVBand="0" w:evenVBand="0" w:oddHBand="0" w:evenHBand="0" w:firstRowFirstColumn="0" w:firstRowLastColumn="0" w:lastRowFirstColumn="0" w:lastRowLastColumn="0"/>
+              <w:rPr>
+                <w:highlight w:val="yellow"/>
+              </w:rPr>
+            </w:pPr>
+            <w:r>
+              <w:rPr>
+                <w:highlight w:val="yellow"/>
+              </w:rPr>
+              <w:t>172.18.188.240</w:t>
+            </w:r>
+            <w:r>
+              <w:rPr>
+                <w:highlight w:val="yellow"/>
+              </w:rPr>
+              <w:t>/28</w:t>
+            </w:r>
           </w:p>
         </w:tc>
       </w:tr>
@@ -16577,6 +17375,12 @@
                 <w:highlight w:val="yellow"/>
               </w:rPr>
             </w:pPr>
+            <w:r>
+              <w:rPr>
+                <w:highlight w:val="yellow"/>
+              </w:rPr>
+              <w:t>255.255.255.240</w:t>
+            </w:r>
           </w:p>
         </w:tc>
       </w:tr>
@@ -16612,6 +17416,12 @@
                 <w:highlight w:val="yellow"/>
               </w:rPr>
             </w:pPr>
+            <w:r>
+              <w:rPr>
+                <w:highlight w:val="yellow"/>
+              </w:rPr>
+              <w:t>14</w:t>
+            </w:r>
           </w:p>
         </w:tc>
       </w:tr>
@@ -21046,7 +21856,6 @@
   <w:style w:type="character" w:default="1" w:styleId="Policepardfaut">
     <w:name w:val="Default Paragraph Font"/>
     <w:uiPriority w:val="1"/>
-    <w:semiHidden/>
     <w:unhideWhenUsed/>
   </w:style>
   <w:style w:type="table" w:default="1" w:styleId="TableauNormal">
@@ -22312,15 +23121,6 @@
 </file>
 
 <file path=customXml/item1.xml><?xml version="1.0" encoding="utf-8"?>
-<?mso-contentType ?>
-<FormTemplates xmlns="http://schemas.microsoft.com/sharepoint/v3/contenttype/forms">
-  <Display>DocumentLibraryForm</Display>
-  <Edit>DocumentLibraryForm</Edit>
-  <New>DocumentLibraryForm</New>
-</FormTemplates>
-</file>
-
-<file path=customXml/item2.xml><?xml version="1.0" encoding="utf-8"?>
 <ct:contentTypeSchema xmlns:ct="http://schemas.microsoft.com/office/2006/metadata/contentType" xmlns:ma="http://schemas.microsoft.com/office/2006/metadata/properties/metaAttributes" ct:_="" ma:_="" ma:contentTypeName="Document" ma:contentTypeID="0x010100B6EB6CCE8CCD4E4DB985DB752124FB64" ma:contentTypeVersion="10" ma:contentTypeDescription="Crée un document." ma:contentTypeScope="" ma:versionID="b659a35cc065ce33eb26c369abf814fa">
   <xsd:schema xmlns:xsd="http://www.w3.org/2001/XMLSchema" xmlns:xs="http://www.w3.org/2001/XMLSchema" xmlns:p="http://schemas.microsoft.com/office/2006/metadata/properties" xmlns:ns2="3c67b34e-3a70-4c82-a88a-c9ff4020302e" xmlns:ns3="b34e80cf-1934-4719-b55f-e2e975c926d7" targetNamespace="http://schemas.microsoft.com/office/2006/metadata/properties" ma:root="true" ma:fieldsID="c93dd5925414f1ca5912f8992d0a2fab" ns2:_="" ns3:_="">
     <xsd:import namespace="3c67b34e-3a70-4c82-a88a-c9ff4020302e"/>
@@ -22509,11 +23309,16 @@
 </ct:contentTypeSchema>
 </file>
 
-<file path=customXml/item3.xml><?xml version="1.0" encoding="utf-8"?>
-<b:Sources xmlns:b="http://schemas.openxmlformats.org/officeDocument/2006/bibliography" xmlns="http://schemas.openxmlformats.org/officeDocument/2006/bibliography" SelectedStyle="\APASixthEditionOfficeOnline.xsl" StyleName="APA" Version="6"/>
+<file path=customXml/item2.xml><?xml version="1.0" encoding="utf-8"?>
+<?mso-contentType ?>
+<FormTemplates xmlns="http://schemas.microsoft.com/sharepoint/v3/contenttype/forms">
+  <Display>DocumentLibraryForm</Display>
+  <Edit>DocumentLibraryForm</Edit>
+  <New>DocumentLibraryForm</New>
+</FormTemplates>
 </file>
 
-<file path=customXml/item4.xml><?xml version="1.0" encoding="utf-8"?>
+<file path=customXml/item3.xml><?xml version="1.0" encoding="utf-8"?>
 <p:properties xmlns:p="http://schemas.microsoft.com/office/2006/metadata/properties" xmlns:xsi="http://www.w3.org/2001/XMLSchema-instance" xmlns:pc="http://schemas.microsoft.com/office/infopath/2007/PartnerControls">
   <documentManagement>
     <TaxCatchAll xmlns="b34e80cf-1934-4719-b55f-e2e975c926d7" xsi:nil="true"/>
@@ -22524,15 +23329,11 @@
 </p:properties>
 </file>
 
-<file path=customXml/itemProps1.xml><?xml version="1.0" encoding="utf-8"?>
-<ds:datastoreItem xmlns:ds="http://schemas.openxmlformats.org/officeDocument/2006/customXml" ds:itemID="{5991A026-0A3A-4A40-9DFB-B1FAB829B1E8}">
-  <ds:schemaRefs>
-    <ds:schemaRef ds:uri="http://schemas.microsoft.com/sharepoint/v3/contenttype/forms"/>
-  </ds:schemaRefs>
-</ds:datastoreItem>
+<file path=customXml/item4.xml><?xml version="1.0" encoding="utf-8"?>
+<b:Sources xmlns:b="http://schemas.openxmlformats.org/officeDocument/2006/bibliography" xmlns="http://schemas.openxmlformats.org/officeDocument/2006/bibliography" SelectedStyle="\APASixthEditionOfficeOnline.xsl" StyleName="APA" Version="6"/>
 </file>
 
-<file path=customXml/itemProps2.xml><?xml version="1.0" encoding="utf-8"?>
+<file path=customXml/itemProps1.xml><?xml version="1.0" encoding="utf-8"?>
 <ds:datastoreItem xmlns:ds="http://schemas.openxmlformats.org/officeDocument/2006/customXml" ds:itemID="{C5AA5C65-6DD8-44D7-80E6-264FE947CA39}">
   <ds:schemaRefs>
     <ds:schemaRef ds:uri="http://schemas.microsoft.com/office/2006/metadata/contentType"/>
@@ -22551,15 +23352,15 @@
 </ds:datastoreItem>
 </file>
 
-<file path=customXml/itemProps3.xml><?xml version="1.0" encoding="utf-8"?>
-<ds:datastoreItem xmlns:ds="http://schemas.openxmlformats.org/officeDocument/2006/customXml" ds:itemID="{20730C14-5559-4816-8D2F-267CB32F4239}">
+<file path=customXml/itemProps2.xml><?xml version="1.0" encoding="utf-8"?>
+<ds:datastoreItem xmlns:ds="http://schemas.openxmlformats.org/officeDocument/2006/customXml" ds:itemID="{5991A026-0A3A-4A40-9DFB-B1FAB829B1E8}">
   <ds:schemaRefs>
-    <ds:schemaRef ds:uri="http://schemas.openxmlformats.org/officeDocument/2006/bibliography"/>
+    <ds:schemaRef ds:uri="http://schemas.microsoft.com/sharepoint/v3/contenttype/forms"/>
   </ds:schemaRefs>
 </ds:datastoreItem>
 </file>
 
-<file path=customXml/itemProps4.xml><?xml version="1.0" encoding="utf-8"?>
+<file path=customXml/itemProps3.xml><?xml version="1.0" encoding="utf-8"?>
 <ds:datastoreItem xmlns:ds="http://schemas.openxmlformats.org/officeDocument/2006/customXml" ds:itemID="{B1A0529D-107D-48F2-9C7A-C9B0532E61D6}">
   <ds:schemaRefs>
     <ds:schemaRef ds:uri="http://schemas.microsoft.com/office/2006/metadata/properties"/>
@@ -22568,4 +23369,12 @@
     <ds:schemaRef ds:uri="3c67b34e-3a70-4c82-a88a-c9ff4020302e"/>
   </ds:schemaRefs>
 </ds:datastoreItem>
+</file>
+
+<file path=customXml/itemProps4.xml><?xml version="1.0" encoding="utf-8"?>
+<ds:datastoreItem xmlns:ds="http://schemas.openxmlformats.org/officeDocument/2006/customXml" ds:itemID="{20730C14-5559-4816-8D2F-267CB32F4239}">
+  <ds:schemaRefs>
+    <ds:schemaRef ds:uri="http://schemas.openxmlformats.org/officeDocument/2006/bibliography"/>
+  </ds:schemaRefs>
+</ds:datastoreItem>
 </file>
</xml_diff>